<commit_message>
sprint 0 last commit
</commit_message>
<xml_diff>
--- a/export/Users/GUC/Japan_Sourcing_Platform/docs/00_Architecture/BA-0002 Domain Model.docx
+++ b/export/Users/GUC/Japan_Sourcing_Platform/docs/00_Architecture/BA-0002 Domain Model.docx
@@ -2,12 +2,312 @@
 <file path=word/document.xml><?xml version="1.0" encoding="utf-8"?>
 <w:document xmlns:w="http://schemas.openxmlformats.org/wordprocessingml/2006/main" xmlns:m="http://schemas.openxmlformats.org/officeDocument/2006/math" xmlns:r="http://schemas.openxmlformats.org/officeDocument/2006/relationships" xmlns:o="urn:schemas-microsoft-com:office:office" xmlns:v="urn:schemas-microsoft-com:vml" xmlns:w10="urn:schemas-microsoft-com:office:word" xmlns:a="http://schemas.openxmlformats.org/drawingml/2006/main" xmlns:pic="http://schemas.openxmlformats.org/drawingml/2006/picture" xmlns:wp="http://schemas.openxmlformats.org/drawingml/2006/wordprocessingDrawing">
   <w:body>
+    <w:bookmarkStart w:id="9" w:name="ba-0002-domain-model"/>
+    <w:p>
+      <w:pPr>
+        <w:pStyle w:val="Heading1"/>
+      </w:pPr>
+      <w:r>
+        <w:t xml:space="preserve">BA-0002 Domain Model</w:t>
+      </w:r>
+    </w:p>
     <w:p>
       <w:pPr>
         <w:pStyle w:val="FirstParagraph"/>
       </w:pPr>
       <w:r>
+        <w:t xml:space="preserve">Document ID</w:t>
+      </w:r>
+    </w:p>
+    <w:p>
+      <w:pPr>
+        <w:pStyle w:val="BodyText"/>
+      </w:pPr>
+      <w:r>
+        <w:t xml:space="preserve">BA-0002</w:t>
+      </w:r>
+    </w:p>
+    <w:p>
+      <w:pPr>
+        <w:pStyle w:val="BodyText"/>
+      </w:pPr>
+      <w:r>
+        <w:t xml:space="preserve">Version</w:t>
+      </w:r>
+    </w:p>
+    <w:p>
+      <w:pPr>
+        <w:pStyle w:val="BodyText"/>
+      </w:pPr>
+      <w:r>
+        <w:t xml:space="preserve">V1.0</w:t>
+      </w:r>
+    </w:p>
+    <w:p>
+      <w:pPr>
+        <w:pStyle w:val="BodyText"/>
+      </w:pPr>
+      <w:r>
+        <w:t xml:space="preserve">Status</w:t>
+      </w:r>
+    </w:p>
+    <w:p>
+      <w:pPr>
+        <w:pStyle w:val="BodyText"/>
+      </w:pPr>
+      <w:r>
+        <w:t xml:space="preserve">Approved</w:t>
+      </w:r>
+    </w:p>
+    <w:p>
+      <w:pPr>
+        <w:pStyle w:val="BodyText"/>
+      </w:pPr>
+      <w:r>
+        <w:t xml:space="preserve">Last Update</w:t>
+      </w:r>
+    </w:p>
+    <w:p>
+      <w:pPr>
+        <w:pStyle w:val="BodyText"/>
+      </w:pPr>
+      <w:r>
+        <w:t xml:space="preserve">2026-06-21</w:t>
+      </w:r>
+    </w:p>
+    <w:p>
+      <w:r>
+        <w:pict>
+          <v:rect style="width:0;height:1.5pt" o:hralign="center" o:hrstd="t" o:hr="t"/>
+        </w:pict>
+      </w:r>
+    </w:p>
+    <w:bookmarkEnd w:id="9"/>
+    <w:bookmarkStart w:id="10" w:name="purpose"/>
+    <w:p>
+      <w:pPr>
+        <w:pStyle w:val="Heading1"/>
+      </w:pPr>
+      <w:r>
+        <w:t xml:space="preserve">1 Purpose</w:t>
+      </w:r>
+    </w:p>
+    <w:p>
+      <w:pPr>
+        <w:pStyle w:val="FirstParagraph"/>
+      </w:pPr>
+      <w:r>
+        <w:t xml:space="preserve">This document defines the business domain model of the Japan Sourcing Platform (JSP).</w:t>
+      </w:r>
+    </w:p>
+    <w:p>
+      <w:pPr>
+        <w:pStyle w:val="BodyText"/>
+      </w:pPr>
+      <w:r>
+        <w:t xml:space="preserve">Unlike the Business Architecture, which focuses on business processes, the Domain Model focuses on business objects and their relationships.</w:t>
+      </w:r>
+    </w:p>
+    <w:p>
+      <w:pPr>
+        <w:pStyle w:val="BodyText"/>
+      </w:pPr>
+      <w:r>
+        <w:t xml:space="preserve">This document is the foundation for:</w:t>
+      </w:r>
+    </w:p>
+    <w:p>
+      <w:pPr>
+        <w:pStyle w:val="Compact"/>
+        <w:numPr>
+          <w:ilvl w:val="0"/>
+          <w:numId w:val="1001"/>
+        </w:numPr>
+      </w:pPr>
+      <w:r>
+        <w:t xml:space="preserve">Database Design</w:t>
+      </w:r>
+    </w:p>
+    <w:p>
+      <w:pPr>
+        <w:pStyle w:val="Compact"/>
+        <w:numPr>
+          <w:ilvl w:val="0"/>
+          <w:numId w:val="1001"/>
+        </w:numPr>
+      </w:pPr>
+      <w:r>
+        <w:t xml:space="preserve">Java Entity Design</w:t>
+      </w:r>
+    </w:p>
+    <w:p>
+      <w:pPr>
+        <w:pStyle w:val="Compact"/>
+        <w:numPr>
+          <w:ilvl w:val="0"/>
+          <w:numId w:val="1001"/>
+        </w:numPr>
+      </w:pPr>
+      <w:r>
+        <w:t xml:space="preserve">REST API Design</w:t>
+      </w:r>
+    </w:p>
+    <w:p>
+      <w:pPr>
+        <w:pStyle w:val="Compact"/>
+        <w:numPr>
+          <w:ilvl w:val="0"/>
+          <w:numId w:val="1001"/>
+        </w:numPr>
+      </w:pPr>
+      <w:r>
+        <w:t xml:space="preserve">UI Design</w:t>
+      </w:r>
+    </w:p>
+    <w:p>
+      <w:r>
+        <w:pict>
+          <v:rect style="width:0;height:1.5pt" o:hralign="center" o:hrstd="t" o:hr="t"/>
+        </w:pict>
+      </w:r>
+    </w:p>
+    <w:bookmarkEnd w:id="10"/>
+    <w:bookmarkStart w:id="11" w:name="core-domain-objects"/>
+    <w:p>
+      <w:pPr>
+        <w:pStyle w:val="Heading1"/>
+      </w:pPr>
+      <w:r>
+        <w:t xml:space="preserve">2 Core Domain Objects</w:t>
+      </w:r>
+    </w:p>
+    <w:p>
+      <w:pPr>
+        <w:pStyle w:val="FirstParagraph"/>
+      </w:pPr>
+      <w:r>
+        <w:t xml:space="preserve">The platform consists of the following core business domains.</w:t>
+      </w:r>
+    </w:p>
+    <w:p>
+      <w:pPr>
+        <w:pStyle w:val="BodyText"/>
+      </w:pPr>
+      <w:r>
         <w:t xml:space="preserve">Supplier</w:t>
+      </w:r>
+    </w:p>
+    <w:p>
+      <w:pPr>
+        <w:pStyle w:val="BodyText"/>
+      </w:pPr>
+      <w:r>
+        <w:t xml:space="preserve">Brand</w:t>
+      </w:r>
+    </w:p>
+    <w:p>
+      <w:pPr>
+        <w:pStyle w:val="BodyText"/>
+      </w:pPr>
+      <w:r>
+        <w:t xml:space="preserve">Product</w:t>
+      </w:r>
+    </w:p>
+    <w:p>
+      <w:pPr>
+        <w:pStyle w:val="BodyText"/>
+      </w:pPr>
+      <w:r>
+        <w:t xml:space="preserve">Catalog</w:t>
+      </w:r>
+    </w:p>
+    <w:p>
+      <w:pPr>
+        <w:pStyle w:val="BodyText"/>
+      </w:pPr>
+      <w:r>
+        <w:t xml:space="preserve">Catalog Item</w:t>
+      </w:r>
+    </w:p>
+    <w:p>
+      <w:pPr>
+        <w:pStyle w:val="BodyText"/>
+      </w:pPr>
+      <w:r>
+        <w:t xml:space="preserve">Lead</w:t>
+      </w:r>
+    </w:p>
+    <w:p>
+      <w:pPr>
+        <w:pStyle w:val="BodyText"/>
+      </w:pPr>
+      <w:r>
+        <w:t xml:space="preserve">Inquiry</w:t>
+      </w:r>
+    </w:p>
+    <w:p>
+      <w:pPr>
+        <w:pStyle w:val="BodyText"/>
+      </w:pPr>
+      <w:r>
+        <w:t xml:space="preserve">Quotation</w:t>
+      </w:r>
+    </w:p>
+    <w:p>
+      <w:pPr>
+        <w:pStyle w:val="BodyText"/>
+      </w:pPr>
+      <w:r>
+        <w:t xml:space="preserve">Purchase Order</w:t>
+      </w:r>
+    </w:p>
+    <w:p>
+      <w:pPr>
+        <w:pStyle w:val="BodyText"/>
+      </w:pPr>
+      <w:r>
+        <w:t xml:space="preserve">Shipment</w:t>
+      </w:r>
+    </w:p>
+    <w:p>
+      <w:pPr>
+        <w:pStyle w:val="BodyText"/>
+      </w:pPr>
+      <w:r>
+        <w:t xml:space="preserve">Customer</w:t>
+      </w:r>
+    </w:p>
+    <w:p>
+      <w:pPr>
+        <w:pStyle w:val="BodyText"/>
+      </w:pPr>
+      <w:r>
+        <w:t xml:space="preserve">Exhibition</w:t>
+      </w:r>
+    </w:p>
+    <w:p>
+      <w:pPr>
+        <w:pStyle w:val="BodyText"/>
+      </w:pPr>
+      <w:r>
+        <w:t xml:space="preserve">Category</w:t>
+      </w:r>
+    </w:p>
+    <w:p>
+      <w:r>
+        <w:pict>
+          <v:rect style="width:0;height:1.5pt" o:hralign="center" o:hrstd="t" o:hr="t"/>
+        </w:pict>
+      </w:r>
+    </w:p>
+    <w:bookmarkEnd w:id="11"/>
+    <w:bookmarkStart w:id="27" w:name="domain-relationship"/>
+    <w:p>
+      <w:pPr>
+        <w:pStyle w:val="Heading1"/>
+      </w:pPr>
+      <w:r>
+        <w:t xml:space="preserve">3 Domain Relationship</w:t>
       </w:r>
     </w:p>
     <w:p>
@@ -18,7 +318,7 @@
         <w:rPr>
           <w:rStyle w:val="VerbatimChar"/>
         </w:rPr>
-        <w:t xml:space="preserve">├──────────────┐</w:t>
+        <w:t xml:space="preserve">              Exhibition</w:t>
       </w:r>
       <w:r>
         <w:br/>
@@ -27,26 +327,16 @@
         <w:rPr>
           <w:rStyle w:val="VerbatimChar"/>
         </w:rPr>
-        <w:t xml:space="preserve">▼              ▼</w:t>
-      </w:r>
-    </w:p>
-    <w:p>
-      <w:pPr>
-        <w:pStyle w:val="FirstParagraph"/>
-      </w:pPr>
-      <w:r>
-        <w:t xml:space="preserve">Brand Exhibition</w:t>
-      </w:r>
-    </w:p>
-    <w:p>
-      <w:pPr>
-        <w:pStyle w:val="SourceCode"/>
-      </w:pPr>
+        <w:t xml:space="preserve">                    │</w:t>
+      </w:r>
+      <w:r>
+        <w:br/>
+      </w:r>
       <w:r>
         <w:rPr>
           <w:rStyle w:val="VerbatimChar"/>
         </w:rPr>
-        <w:t xml:space="preserve">└──────┬───────┘</w:t>
+        <w:t xml:space="preserve">                    │       discovers</w:t>
       </w:r>
       <w:r>
         <w:br/>
@@ -55,7 +345,7 @@
         <w:rPr>
           <w:rStyle w:val="VerbatimChar"/>
         </w:rPr>
-        <w:t xml:space="preserve">       ▼</w:t>
+        <w:t xml:space="preserve">                    ▼</w:t>
       </w:r>
       <w:r>
         <w:br/>
@@ -64,7 +354,7 @@
         <w:rPr>
           <w:rStyle w:val="VerbatimChar"/>
         </w:rPr>
-        <w:t xml:space="preserve">   Discovery</w:t>
+        <w:t xml:space="preserve">               Supplier</w:t>
       </w:r>
       <w:r>
         <w:br/>
@@ -73,7 +363,7 @@
         <w:rPr>
           <w:rStyle w:val="VerbatimChar"/>
         </w:rPr>
-        <w:t xml:space="preserve">       │</w:t>
+        <w:t xml:space="preserve">                    │</w:t>
       </w:r>
       <w:r>
         <w:br/>
@@ -82,7 +372,7 @@
         <w:rPr>
           <w:rStyle w:val="VerbatimChar"/>
         </w:rPr>
-        <w:t xml:space="preserve">       ▼</w:t>
+        <w:t xml:space="preserve">       owns         │</w:t>
       </w:r>
       <w:r>
         <w:br/>
@@ -91,7 +381,7 @@
         <w:rPr>
           <w:rStyle w:val="VerbatimChar"/>
         </w:rPr>
-        <w:t xml:space="preserve">   Catalog</w:t>
+        <w:t xml:space="preserve">                    ▼</w:t>
       </w:r>
       <w:r>
         <w:br/>
@@ -100,7 +390,7 @@
         <w:rPr>
           <w:rStyle w:val="VerbatimChar"/>
         </w:rPr>
-        <w:t xml:space="preserve">       │</w:t>
+        <w:t xml:space="preserve">                 Brand</w:t>
       </w:r>
       <w:r>
         <w:br/>
@@ -109,7 +399,7 @@
         <w:rPr>
           <w:rStyle w:val="VerbatimChar"/>
         </w:rPr>
-        <w:t xml:space="preserve"> ┌─────┴─────┐</w:t>
+        <w:t xml:space="preserve">                    │</w:t>
       </w:r>
       <w:r>
         <w:br/>
@@ -118,26 +408,16 @@
         <w:rPr>
           <w:rStyle w:val="VerbatimChar"/>
         </w:rPr>
-        <w:t xml:space="preserve"> ▼           ▼</w:t>
-      </w:r>
-    </w:p>
-    <w:p>
-      <w:pPr>
-        <w:pStyle w:val="FirstParagraph"/>
-      </w:pPr>
-      <w:r>
-        <w:t xml:space="preserve">Product Catalog Item</w:t>
-      </w:r>
-    </w:p>
-    <w:p>
-      <w:pPr>
-        <w:pStyle w:val="SourceCode"/>
-      </w:pPr>
+        <w:t xml:space="preserve">            contains Products</w:t>
+      </w:r>
+      <w:r>
+        <w:br/>
+      </w:r>
       <w:r>
         <w:rPr>
           <w:rStyle w:val="VerbatimChar"/>
         </w:rPr>
-        <w:t xml:space="preserve"> │</w:t>
+        <w:t xml:space="preserve">                    │</w:t>
       </w:r>
       <w:r>
         <w:br/>
@@ -146,26 +426,16 @@
         <w:rPr>
           <w:rStyle w:val="VerbatimChar"/>
         </w:rPr>
-        <w:t xml:space="preserve"> ▼</w:t>
-      </w:r>
-    </w:p>
-    <w:p>
-      <w:pPr>
-        <w:pStyle w:val="FirstParagraph"/>
-      </w:pPr>
-      <w:r>
-        <w:t xml:space="preserve">Inquiry</w:t>
-      </w:r>
-    </w:p>
-    <w:p>
-      <w:pPr>
-        <w:pStyle w:val="SourceCode"/>
-      </w:pPr>
+        <w:t xml:space="preserve">                    ▼</w:t>
+      </w:r>
+      <w:r>
+        <w:br/>
+      </w:r>
       <w:r>
         <w:rPr>
           <w:rStyle w:val="VerbatimChar"/>
         </w:rPr>
-        <w:t xml:space="preserve"> │</w:t>
+        <w:t xml:space="preserve">                Product</w:t>
       </w:r>
       <w:r>
         <w:br/>
@@ -174,26 +444,16 @@
         <w:rPr>
           <w:rStyle w:val="VerbatimChar"/>
         </w:rPr>
-        <w:t xml:space="preserve"> ▼</w:t>
-      </w:r>
-    </w:p>
-    <w:p>
-      <w:pPr>
-        <w:pStyle w:val="FirstParagraph"/>
-      </w:pPr>
-      <w:r>
-        <w:t xml:space="preserve">Quote</w:t>
-      </w:r>
-    </w:p>
-    <w:p>
-      <w:pPr>
-        <w:pStyle w:val="SourceCode"/>
-      </w:pPr>
+        <w:t xml:space="preserve">                    ▲</w:t>
+      </w:r>
+      <w:r>
+        <w:br/>
+      </w:r>
       <w:r>
         <w:rPr>
           <w:rStyle w:val="VerbatimChar"/>
         </w:rPr>
-        <w:t xml:space="preserve"> │</w:t>
+        <w:t xml:space="preserve">                    │</w:t>
       </w:r>
       <w:r>
         <w:br/>
@@ -202,26 +462,16 @@
         <w:rPr>
           <w:rStyle w:val="VerbatimChar"/>
         </w:rPr>
-        <w:t xml:space="preserve"> ▼</w:t>
-      </w:r>
-    </w:p>
-    <w:p>
-      <w:pPr>
-        <w:pStyle w:val="FirstParagraph"/>
-      </w:pPr>
-      <w:r>
-        <w:t xml:space="preserve">Purchase</w:t>
-      </w:r>
-    </w:p>
-    <w:p>
-      <w:pPr>
-        <w:pStyle w:val="SourceCode"/>
-      </w:pPr>
+        <w:t xml:space="preserve">          included in</w:t>
+      </w:r>
+      <w:r>
+        <w:br/>
+      </w:r>
       <w:r>
         <w:rPr>
           <w:rStyle w:val="VerbatimChar"/>
         </w:rPr>
-        <w:t xml:space="preserve"> │</w:t>
+        <w:t xml:space="preserve">                    │</w:t>
       </w:r>
       <w:r>
         <w:br/>
@@ -230,7 +480,43 @@
         <w:rPr>
           <w:rStyle w:val="VerbatimChar"/>
         </w:rPr>
-        <w:t xml:space="preserve"> ▼</w:t>
+        <w:t xml:space="preserve">              Catalog Item</w:t>
+      </w:r>
+      <w:r>
+        <w:br/>
+      </w:r>
+      <w:r>
+        <w:rPr>
+          <w:rStyle w:val="VerbatimChar"/>
+        </w:rPr>
+        <w:t xml:space="preserve">                    │</w:t>
+      </w:r>
+      <w:r>
+        <w:br/>
+      </w:r>
+      <w:r>
+        <w:rPr>
+          <w:rStyle w:val="VerbatimChar"/>
+        </w:rPr>
+        <w:t xml:space="preserve">                    ▼</w:t>
+      </w:r>
+      <w:r>
+        <w:br/>
+      </w:r>
+      <w:r>
+        <w:rPr>
+          <w:rStyle w:val="VerbatimChar"/>
+        </w:rPr>
+        <w:t xml:space="preserve">                Catalog</w:t>
+      </w:r>
+    </w:p>
+    <w:bookmarkStart w:id="12" w:name="customer-journey"/>
+    <w:p>
+      <w:pPr>
+        <w:pStyle w:val="Heading2"/>
+      </w:pPr>
+      <w:r>
+        <w:t xml:space="preserve">Customer Journey</w:t>
       </w:r>
     </w:p>
     <w:p>
@@ -238,17 +524,1751 @@
         <w:pStyle w:val="FirstParagraph"/>
       </w:pPr>
       <w:r>
+        <w:t xml:space="preserve">Lead</w:t>
+      </w:r>
+      <w:r>
+        <w:t xml:space="preserve"> </w:t>
+      </w:r>
+      <w:r>
+        <w:t xml:space="preserve">│</w:t>
+      </w:r>
+      <w:r>
+        <w:t xml:space="preserve"> </w:t>
+      </w:r>
+      <w:r>
+        <w:t xml:space="preserve">▼</w:t>
+      </w:r>
+      <w:r>
+        <w:t xml:space="preserve"> </w:t>
+      </w:r>
+      <w:r>
+        <w:t xml:space="preserve">Inquiry</w:t>
+      </w:r>
+      <w:r>
+        <w:t xml:space="preserve"> </w:t>
+      </w:r>
+      <w:r>
+        <w:t xml:space="preserve">│</w:t>
+      </w:r>
+      <w:r>
+        <w:t xml:space="preserve"> </w:t>
+      </w:r>
+      <w:r>
+        <w:t xml:space="preserve">▼</w:t>
+      </w:r>
+      <w:r>
+        <w:t xml:space="preserve"> </w:t>
+      </w:r>
+      <w:r>
+        <w:t xml:space="preserve">Quotation</w:t>
+      </w:r>
+      <w:r>
+        <w:t xml:space="preserve"> </w:t>
+      </w:r>
+      <w:r>
+        <w:t xml:space="preserve">│</w:t>
+      </w:r>
+      <w:r>
+        <w:t xml:space="preserve"> </w:t>
+      </w:r>
+      <w:r>
+        <w:t xml:space="preserve">▼</w:t>
+      </w:r>
+      <w:r>
+        <w:t xml:space="preserve"> </w:t>
+      </w:r>
+      <w:r>
+        <w:t xml:space="preserve">Purchase Order</w:t>
+      </w:r>
+      <w:r>
+        <w:t xml:space="preserve"> </w:t>
+      </w:r>
+      <w:r>
+        <w:t xml:space="preserve">│</w:t>
+      </w:r>
+      <w:r>
+        <w:t xml:space="preserve"> </w:t>
+      </w:r>
+      <w:r>
+        <w:t xml:space="preserve">▼</w:t>
+      </w:r>
+      <w:r>
+        <w:t xml:space="preserve"> </w:t>
+      </w:r>
+      <w:r>
         <w:t xml:space="preserve">Shipment</w:t>
       </w:r>
-    </w:p>
-    <w:p>
-      <w:pPr>
-        <w:pStyle w:val="BodyText"/>
-      </w:pPr>
-      <w:r>
-        <w:t xml:space="preserve">Lead ───────────────► Customer</w:t>
-      </w:r>
-    </w:p>
+      <w:r>
+        <w:t xml:space="preserve"> </w:t>
+      </w:r>
+      <w:r>
+        <w:t xml:space="preserve">│</w:t>
+      </w:r>
+      <w:r>
+        <w:t xml:space="preserve"> </w:t>
+      </w:r>
+      <w:r>
+        <w:t xml:space="preserve">▼</w:t>
+      </w:r>
+      <w:r>
+        <w:t xml:space="preserve"> </w:t>
+      </w:r>
+      <w:r>
+        <w:t xml:space="preserve">Customer</w:t>
+      </w:r>
+    </w:p>
+    <w:p>
+      <w:pPr>
+        <w:pStyle w:val="BodyText"/>
+      </w:pPr>
+      <w:r>
+        <w:t xml:space="preserve">```</w:t>
+      </w:r>
+    </w:p>
+    <w:p>
+      <w:r>
+        <w:pict>
+          <v:rect style="width:0;height:1.5pt" o:hralign="center" o:hrstd="t" o:hr="t"/>
+        </w:pict>
+      </w:r>
+    </w:p>
+    <w:bookmarkEnd w:id="12"/>
+    <w:bookmarkStart w:id="26" w:name="domain-description"/>
+    <w:p>
+      <w:pPr>
+        <w:pStyle w:val="Heading2"/>
+      </w:pPr>
+      <w:r>
+        <w:t xml:space="preserve">4 Domain Description</w:t>
+      </w:r>
+    </w:p>
+    <w:bookmarkStart w:id="13" w:name="supplier"/>
+    <w:p>
+      <w:pPr>
+        <w:pStyle w:val="Heading3"/>
+      </w:pPr>
+      <w:r>
+        <w:t xml:space="preserve">4.1 Supplier</w:t>
+      </w:r>
+    </w:p>
+    <w:p>
+      <w:pPr>
+        <w:pStyle w:val="FirstParagraph"/>
+      </w:pPr>
+      <w:r>
+        <w:t xml:space="preserve">Represents a Japanese manufacturer, trading company or factory.</w:t>
+      </w:r>
+    </w:p>
+    <w:p>
+      <w:pPr>
+        <w:pStyle w:val="BodyText"/>
+      </w:pPr>
+      <w:r>
+        <w:t xml:space="preserve">Responsibilities</w:t>
+      </w:r>
+    </w:p>
+    <w:p>
+      <w:pPr>
+        <w:pStyle w:val="Compact"/>
+        <w:numPr>
+          <w:ilvl w:val="0"/>
+          <w:numId w:val="1002"/>
+        </w:numPr>
+      </w:pPr>
+      <w:r>
+        <w:t xml:space="preserve">Supply products</w:t>
+      </w:r>
+    </w:p>
+    <w:p>
+      <w:pPr>
+        <w:pStyle w:val="Compact"/>
+        <w:numPr>
+          <w:ilvl w:val="0"/>
+          <w:numId w:val="1002"/>
+        </w:numPr>
+      </w:pPr>
+      <w:r>
+        <w:t xml:space="preserve">Maintain contact information</w:t>
+      </w:r>
+    </w:p>
+    <w:p>
+      <w:pPr>
+        <w:pStyle w:val="Compact"/>
+        <w:numPr>
+          <w:ilvl w:val="0"/>
+          <w:numId w:val="1002"/>
+        </w:numPr>
+      </w:pPr>
+      <w:r>
+        <w:t xml:space="preserve">Participate in exhibitions</w:t>
+      </w:r>
+    </w:p>
+    <w:p>
+      <w:pPr>
+        <w:pStyle w:val="Compact"/>
+        <w:numPr>
+          <w:ilvl w:val="0"/>
+          <w:numId w:val="1002"/>
+        </w:numPr>
+      </w:pPr>
+      <w:r>
+        <w:t xml:space="preserve">Support export business</w:t>
+      </w:r>
+    </w:p>
+    <w:p>
+      <w:pPr>
+        <w:pStyle w:val="FirstParagraph"/>
+      </w:pPr>
+      <w:r>
+        <w:t xml:space="preserve">Relationships</w:t>
+      </w:r>
+    </w:p>
+    <w:p>
+      <w:pPr>
+        <w:pStyle w:val="BodyText"/>
+      </w:pPr>
+      <w:r>
+        <w:t xml:space="preserve">Supplier</w:t>
+      </w:r>
+    </w:p>
+    <w:p>
+      <w:pPr>
+        <w:pStyle w:val="BodyText"/>
+      </w:pPr>
+      <w:r>
+        <w:t xml:space="preserve">↓</w:t>
+      </w:r>
+    </w:p>
+    <w:p>
+      <w:pPr>
+        <w:pStyle w:val="BodyText"/>
+      </w:pPr>
+      <w:r>
+        <w:t xml:space="preserve">Brand (1:N)</w:t>
+      </w:r>
+    </w:p>
+    <w:p>
+      <w:pPr>
+        <w:pStyle w:val="BodyText"/>
+      </w:pPr>
+      <w:r>
+        <w:t xml:space="preserve">↓</w:t>
+      </w:r>
+    </w:p>
+    <w:p>
+      <w:pPr>
+        <w:pStyle w:val="BodyText"/>
+      </w:pPr>
+      <w:r>
+        <w:t xml:space="preserve">Product (1:N)</w:t>
+      </w:r>
+    </w:p>
+    <w:p>
+      <w:r>
+        <w:pict>
+          <v:rect style="width:0;height:1.5pt" o:hralign="center" o:hrstd="t" o:hr="t"/>
+        </w:pict>
+      </w:r>
+    </w:p>
+    <w:bookmarkEnd w:id="13"/>
+    <w:bookmarkStart w:id="14" w:name="brand"/>
+    <w:p>
+      <w:pPr>
+        <w:pStyle w:val="Heading3"/>
+      </w:pPr>
+      <w:r>
+        <w:t xml:space="preserve">4.2 Brand</w:t>
+      </w:r>
+    </w:p>
+    <w:p>
+      <w:pPr>
+        <w:pStyle w:val="FirstParagraph"/>
+      </w:pPr>
+      <w:r>
+        <w:t xml:space="preserve">Represents a commercial brand.</w:t>
+      </w:r>
+    </w:p>
+    <w:p>
+      <w:pPr>
+        <w:pStyle w:val="BodyText"/>
+      </w:pPr>
+      <w:r>
+        <w:t xml:space="preserve">One Supplier may own multiple Brands.</w:t>
+      </w:r>
+    </w:p>
+    <w:p>
+      <w:pPr>
+        <w:pStyle w:val="BodyText"/>
+      </w:pPr>
+      <w:r>
+        <w:t xml:space="preserve">One Brand may appear in multiple Catalogs.</w:t>
+      </w:r>
+    </w:p>
+    <w:p>
+      <w:r>
+        <w:pict>
+          <v:rect style="width:0;height:1.5pt" o:hralign="center" o:hrstd="t" o:hr="t"/>
+        </w:pict>
+      </w:r>
+    </w:p>
+    <w:bookmarkEnd w:id="14"/>
+    <w:bookmarkStart w:id="15" w:name="product"/>
+    <w:p>
+      <w:pPr>
+        <w:pStyle w:val="Heading3"/>
+      </w:pPr>
+      <w:r>
+        <w:t xml:space="preserve">4.3 Product</w:t>
+      </w:r>
+    </w:p>
+    <w:p>
+      <w:pPr>
+        <w:pStyle w:val="FirstParagraph"/>
+      </w:pPr>
+      <w:r>
+        <w:t xml:space="preserve">Represents a purchasable item.</w:t>
+      </w:r>
+    </w:p>
+    <w:p>
+      <w:pPr>
+        <w:pStyle w:val="BodyText"/>
+      </w:pPr>
+      <w:r>
+        <w:t xml:space="preserve">Products belong to one Brand.</w:t>
+      </w:r>
+    </w:p>
+    <w:p>
+      <w:pPr>
+        <w:pStyle w:val="BodyText"/>
+      </w:pPr>
+      <w:r>
+        <w:t xml:space="preserve">Products belong to one Category.</w:t>
+      </w:r>
+    </w:p>
+    <w:p>
+      <w:pPr>
+        <w:pStyle w:val="BodyText"/>
+      </w:pPr>
+      <w:r>
+        <w:t xml:space="preserve">Products may appear in multiple Catalogs.</w:t>
+      </w:r>
+    </w:p>
+    <w:p>
+      <w:pPr>
+        <w:pStyle w:val="BodyText"/>
+      </w:pPr>
+      <w:r>
+        <w:t xml:space="preserve">Products may exist before public publication.</w:t>
+      </w:r>
+    </w:p>
+    <w:p>
+      <w:r>
+        <w:pict>
+          <v:rect style="width:0;height:1.5pt" o:hralign="center" o:hrstd="t" o:hr="t"/>
+        </w:pict>
+      </w:r>
+    </w:p>
+    <w:bookmarkEnd w:id="15"/>
+    <w:bookmarkStart w:id="16" w:name="catalog"/>
+    <w:p>
+      <w:pPr>
+        <w:pStyle w:val="Heading3"/>
+      </w:pPr>
+      <w:r>
+        <w:t xml:space="preserve">4.4 Catalog</w:t>
+      </w:r>
+    </w:p>
+    <w:p>
+      <w:pPr>
+        <w:pStyle w:val="FirstParagraph"/>
+      </w:pPr>
+      <w:r>
+        <w:t xml:space="preserve">Marketing document.</w:t>
+      </w:r>
+    </w:p>
+    <w:p>
+      <w:pPr>
+        <w:pStyle w:val="BodyText"/>
+      </w:pPr>
+      <w:r>
+        <w:t xml:space="preserve">Contains multiple Catalog Items.</w:t>
+      </w:r>
+    </w:p>
+    <w:p>
+      <w:pPr>
+        <w:pStyle w:val="BodyText"/>
+      </w:pPr>
+      <w:r>
+        <w:t xml:space="preserve">Supports Lead generation.</w:t>
+      </w:r>
+    </w:p>
+    <w:p>
+      <w:pPr>
+        <w:pStyle w:val="BodyText"/>
+      </w:pPr>
+      <w:r>
+        <w:t xml:space="preserve">Independent from Product lifecycle.</w:t>
+      </w:r>
+    </w:p>
+    <w:p>
+      <w:r>
+        <w:pict>
+          <v:rect style="width:0;height:1.5pt" o:hralign="center" o:hrstd="t" o:hr="t"/>
+        </w:pict>
+      </w:r>
+    </w:p>
+    <w:bookmarkEnd w:id="16"/>
+    <w:bookmarkStart w:id="17" w:name="catalog-item"/>
+    <w:p>
+      <w:pPr>
+        <w:pStyle w:val="Heading3"/>
+      </w:pPr>
+      <w:r>
+        <w:t xml:space="preserve">4.5 Catalog Item</w:t>
+      </w:r>
+    </w:p>
+    <w:p>
+      <w:pPr>
+        <w:pStyle w:val="FirstParagraph"/>
+      </w:pPr>
+      <w:r>
+        <w:t xml:space="preserve">Relationship object.</w:t>
+      </w:r>
+    </w:p>
+    <w:p>
+      <w:pPr>
+        <w:pStyle w:val="BodyText"/>
+      </w:pPr>
+      <w:r>
+        <w:t xml:space="preserve">Catalog</w:t>
+      </w:r>
+    </w:p>
+    <w:p>
+      <w:pPr>
+        <w:pStyle w:val="BodyText"/>
+      </w:pPr>
+      <w:r>
+        <w:t xml:space="preserve">↓</w:t>
+      </w:r>
+    </w:p>
+    <w:p>
+      <w:pPr>
+        <w:pStyle w:val="BodyText"/>
+      </w:pPr>
+      <w:r>
+        <w:t xml:space="preserve">Catalog Item</w:t>
+      </w:r>
+    </w:p>
+    <w:p>
+      <w:pPr>
+        <w:pStyle w:val="BodyText"/>
+      </w:pPr>
+      <w:r>
+        <w:t xml:space="preserve">↓</w:t>
+      </w:r>
+    </w:p>
+    <w:p>
+      <w:pPr>
+        <w:pStyle w:val="BodyText"/>
+      </w:pPr>
+      <w:r>
+        <w:t xml:space="preserve">Product</w:t>
+      </w:r>
+    </w:p>
+    <w:p>
+      <w:pPr>
+        <w:pStyle w:val="BodyText"/>
+      </w:pPr>
+      <w:r>
+        <w:t xml:space="preserve">Purpose</w:t>
+      </w:r>
+    </w:p>
+    <w:p>
+      <w:pPr>
+        <w:pStyle w:val="BodyText"/>
+      </w:pPr>
+      <w:r>
+        <w:t xml:space="preserve">One Product may appear in many Catalogs.</w:t>
+      </w:r>
+    </w:p>
+    <w:p>
+      <w:r>
+        <w:pict>
+          <v:rect style="width:0;height:1.5pt" o:hralign="center" o:hrstd="t" o:hr="t"/>
+        </w:pict>
+      </w:r>
+    </w:p>
+    <w:bookmarkEnd w:id="17"/>
+    <w:bookmarkStart w:id="18" w:name="lead"/>
+    <w:p>
+      <w:pPr>
+        <w:pStyle w:val="Heading3"/>
+      </w:pPr>
+      <w:r>
+        <w:t xml:space="preserve">4.6 Lead</w:t>
+      </w:r>
+    </w:p>
+    <w:p>
+      <w:pPr>
+        <w:pStyle w:val="FirstParagraph"/>
+      </w:pPr>
+      <w:r>
+        <w:t xml:space="preserve">Potential customer.</w:t>
+      </w:r>
+    </w:p>
+    <w:p>
+      <w:pPr>
+        <w:pStyle w:val="BodyText"/>
+      </w:pPr>
+      <w:r>
+        <w:t xml:space="preserve">Created from:</w:t>
+      </w:r>
+    </w:p>
+    <w:p>
+      <w:pPr>
+        <w:pStyle w:val="Compact"/>
+        <w:numPr>
+          <w:ilvl w:val="0"/>
+          <w:numId w:val="1003"/>
+        </w:numPr>
+      </w:pPr>
+      <w:r>
+        <w:t xml:space="preserve">Catalog Download</w:t>
+      </w:r>
+    </w:p>
+    <w:p>
+      <w:pPr>
+        <w:pStyle w:val="Compact"/>
+        <w:numPr>
+          <w:ilvl w:val="0"/>
+          <w:numId w:val="1003"/>
+        </w:numPr>
+      </w:pPr>
+      <w:r>
+        <w:t xml:space="preserve">Inquiry</w:t>
+      </w:r>
+    </w:p>
+    <w:p>
+      <w:pPr>
+        <w:pStyle w:val="Compact"/>
+        <w:numPr>
+          <w:ilvl w:val="0"/>
+          <w:numId w:val="1003"/>
+        </w:numPr>
+      </w:pPr>
+      <w:r>
+        <w:t xml:space="preserve">Exhibition</w:t>
+      </w:r>
+    </w:p>
+    <w:p>
+      <w:pPr>
+        <w:pStyle w:val="Compact"/>
+        <w:numPr>
+          <w:ilvl w:val="0"/>
+          <w:numId w:val="1003"/>
+        </w:numPr>
+      </w:pPr>
+      <w:r>
+        <w:t xml:space="preserve">Manual Registration</w:t>
+      </w:r>
+    </w:p>
+    <w:p>
+      <w:pPr>
+        <w:pStyle w:val="FirstParagraph"/>
+      </w:pPr>
+      <w:r>
+        <w:t xml:space="preserve">Lead may become Customer.</w:t>
+      </w:r>
+    </w:p>
+    <w:p>
+      <w:r>
+        <w:pict>
+          <v:rect style="width:0;height:1.5pt" o:hralign="center" o:hrstd="t" o:hr="t"/>
+        </w:pict>
+      </w:r>
+    </w:p>
+    <w:bookmarkEnd w:id="18"/>
+    <w:bookmarkStart w:id="19" w:name="inquiry"/>
+    <w:p>
+      <w:pPr>
+        <w:pStyle w:val="Heading3"/>
+      </w:pPr>
+      <w:r>
+        <w:t xml:space="preserve">4.7 Inquiry</w:t>
+      </w:r>
+    </w:p>
+    <w:p>
+      <w:pPr>
+        <w:pStyle w:val="FirstParagraph"/>
+      </w:pPr>
+      <w:r>
+        <w:t xml:space="preserve">Represents customer’s purchasing request.</w:t>
+      </w:r>
+    </w:p>
+    <w:p>
+      <w:pPr>
+        <w:pStyle w:val="BodyText"/>
+      </w:pPr>
+      <w:r>
+        <w:t xml:space="preserve">Business Rules</w:t>
+      </w:r>
+    </w:p>
+    <w:p>
+      <w:pPr>
+        <w:pStyle w:val="BodyText"/>
+      </w:pPr>
+      <w:r>
+        <w:t xml:space="preserve">Immutable.</w:t>
+      </w:r>
+    </w:p>
+    <w:p>
+      <w:pPr>
+        <w:pStyle w:val="BodyText"/>
+      </w:pPr>
+      <w:r>
+        <w:t xml:space="preserve">Revision creates a new Inquiry.</w:t>
+      </w:r>
+    </w:p>
+    <w:p>
+      <w:pPr>
+        <w:pStyle w:val="BodyText"/>
+      </w:pPr>
+      <w:r>
+        <w:t xml:space="preserve">One Lead</w:t>
+      </w:r>
+    </w:p>
+    <w:p>
+      <w:pPr>
+        <w:pStyle w:val="BodyText"/>
+      </w:pPr>
+      <w:r>
+        <w:t xml:space="preserve">↓</w:t>
+      </w:r>
+    </w:p>
+    <w:p>
+      <w:pPr>
+        <w:pStyle w:val="BodyText"/>
+      </w:pPr>
+      <w:r>
+        <w:t xml:space="preserve">Many Inquiries</w:t>
+      </w:r>
+    </w:p>
+    <w:p>
+      <w:r>
+        <w:pict>
+          <v:rect style="width:0;height:1.5pt" o:hralign="center" o:hrstd="t" o:hr="t"/>
+        </w:pict>
+      </w:r>
+    </w:p>
+    <w:bookmarkEnd w:id="19"/>
+    <w:bookmarkStart w:id="20" w:name="quotation"/>
+    <w:p>
+      <w:pPr>
+        <w:pStyle w:val="Heading3"/>
+      </w:pPr>
+      <w:r>
+        <w:t xml:space="preserve">4.8 Quotation</w:t>
+      </w:r>
+    </w:p>
+    <w:p>
+      <w:pPr>
+        <w:pStyle w:val="FirstParagraph"/>
+      </w:pPr>
+      <w:r>
+        <w:t xml:space="preserve">Prepared manually by Sales.</w:t>
+      </w:r>
+    </w:p>
+    <w:p>
+      <w:pPr>
+        <w:pStyle w:val="BodyText"/>
+      </w:pPr>
+      <w:r>
+        <w:t xml:space="preserve">Based on one Inquiry.</w:t>
+      </w:r>
+    </w:p>
+    <w:p>
+      <w:pPr>
+        <w:pStyle w:val="BodyText"/>
+      </w:pPr>
+      <w:r>
+        <w:t xml:space="preserve">Contains:</w:t>
+      </w:r>
+    </w:p>
+    <w:p>
+      <w:pPr>
+        <w:pStyle w:val="BodyText"/>
+      </w:pPr>
+      <w:r>
+        <w:t xml:space="preserve">Products</w:t>
+      </w:r>
+    </w:p>
+    <w:p>
+      <w:pPr>
+        <w:pStyle w:val="BodyText"/>
+      </w:pPr>
+      <w:r>
+        <w:t xml:space="preserve">Prices</w:t>
+      </w:r>
+    </w:p>
+    <w:p>
+      <w:pPr>
+        <w:pStyle w:val="BodyText"/>
+      </w:pPr>
+      <w:r>
+        <w:t xml:space="preserve">Shipping</w:t>
+      </w:r>
+    </w:p>
+    <w:p>
+      <w:pPr>
+        <w:pStyle w:val="BodyText"/>
+      </w:pPr>
+      <w:r>
+        <w:t xml:space="preserve">Validity</w:t>
+      </w:r>
+    </w:p>
+    <w:p>
+      <w:r>
+        <w:pict>
+          <v:rect style="width:0;height:1.5pt" o:hralign="center" o:hrstd="t" o:hr="t"/>
+        </w:pict>
+      </w:r>
+    </w:p>
+    <w:bookmarkEnd w:id="20"/>
+    <w:bookmarkStart w:id="21" w:name="purchase-order"/>
+    <w:p>
+      <w:pPr>
+        <w:pStyle w:val="Heading3"/>
+      </w:pPr>
+      <w:r>
+        <w:t xml:space="preserve">4.9 Purchase Order</w:t>
+      </w:r>
+    </w:p>
+    <w:p>
+      <w:pPr>
+        <w:pStyle w:val="FirstParagraph"/>
+      </w:pPr>
+      <w:r>
+        <w:t xml:space="preserve">Internal purchasing document.</w:t>
+      </w:r>
+    </w:p>
+    <w:p>
+      <w:pPr>
+        <w:pStyle w:val="BodyText"/>
+      </w:pPr>
+      <w:r>
+        <w:t xml:space="preserve">Created after customer confirmation.</w:t>
+      </w:r>
+    </w:p>
+    <w:p>
+      <w:pPr>
+        <w:pStyle w:val="BodyText"/>
+      </w:pPr>
+      <w:r>
+        <w:t xml:space="preserve">Sent to Supplier.</w:t>
+      </w:r>
+    </w:p>
+    <w:p>
+      <w:r>
+        <w:pict>
+          <v:rect style="width:0;height:1.5pt" o:hralign="center" o:hrstd="t" o:hr="t"/>
+        </w:pict>
+      </w:r>
+    </w:p>
+    <w:bookmarkEnd w:id="21"/>
+    <w:bookmarkStart w:id="22" w:name="shipment"/>
+    <w:p>
+      <w:pPr>
+        <w:pStyle w:val="Heading3"/>
+      </w:pPr>
+      <w:r>
+        <w:t xml:space="preserve">4.10 Shipment</w:t>
+      </w:r>
+    </w:p>
+    <w:p>
+      <w:pPr>
+        <w:pStyle w:val="FirstParagraph"/>
+      </w:pPr>
+      <w:r>
+        <w:t xml:space="preserve">Represents export logistics.</w:t>
+      </w:r>
+    </w:p>
+    <w:p>
+      <w:pPr>
+        <w:pStyle w:val="BodyText"/>
+      </w:pPr>
+      <w:r>
+        <w:t xml:space="preserve">Contains:</w:t>
+      </w:r>
+    </w:p>
+    <w:p>
+      <w:pPr>
+        <w:pStyle w:val="BodyText"/>
+      </w:pPr>
+      <w:r>
+        <w:t xml:space="preserve">Packing</w:t>
+      </w:r>
+    </w:p>
+    <w:p>
+      <w:pPr>
+        <w:pStyle w:val="BodyText"/>
+      </w:pPr>
+      <w:r>
+        <w:t xml:space="preserve">Tracking</w:t>
+      </w:r>
+    </w:p>
+    <w:p>
+      <w:pPr>
+        <w:pStyle w:val="BodyText"/>
+      </w:pPr>
+      <w:r>
+        <w:t xml:space="preserve">Documents</w:t>
+      </w:r>
+    </w:p>
+    <w:p>
+      <w:pPr>
+        <w:pStyle w:val="BodyText"/>
+      </w:pPr>
+      <w:r>
+        <w:t xml:space="preserve">Delivery</w:t>
+      </w:r>
+    </w:p>
+    <w:p>
+      <w:r>
+        <w:pict>
+          <v:rect style="width:0;height:1.5pt" o:hralign="center" o:hrstd="t" o:hr="t"/>
+        </w:pict>
+      </w:r>
+    </w:p>
+    <w:bookmarkEnd w:id="22"/>
+    <w:bookmarkStart w:id="23" w:name="customer"/>
+    <w:p>
+      <w:pPr>
+        <w:pStyle w:val="Heading3"/>
+      </w:pPr>
+      <w:r>
+        <w:t xml:space="preserve">4.11 Customer</w:t>
+      </w:r>
+    </w:p>
+    <w:p>
+      <w:pPr>
+        <w:pStyle w:val="FirstParagraph"/>
+      </w:pPr>
+      <w:r>
+        <w:t xml:space="preserve">Represents long-term business partner.</w:t>
+      </w:r>
+    </w:p>
+    <w:p>
+      <w:pPr>
+        <w:pStyle w:val="BodyText"/>
+      </w:pPr>
+      <w:r>
+        <w:t xml:space="preserve">Customer may have:</w:t>
+      </w:r>
+    </w:p>
+    <w:p>
+      <w:pPr>
+        <w:pStyle w:val="BodyText"/>
+      </w:pPr>
+      <w:r>
+        <w:t xml:space="preserve">Many Contacts</w:t>
+      </w:r>
+    </w:p>
+    <w:p>
+      <w:pPr>
+        <w:pStyle w:val="BodyText"/>
+      </w:pPr>
+      <w:r>
+        <w:t xml:space="preserve">Many Inquiries</w:t>
+      </w:r>
+    </w:p>
+    <w:p>
+      <w:pPr>
+        <w:pStyle w:val="BodyText"/>
+      </w:pPr>
+      <w:r>
+        <w:t xml:space="preserve">Many Quotations</w:t>
+      </w:r>
+    </w:p>
+    <w:p>
+      <w:pPr>
+        <w:pStyle w:val="BodyText"/>
+      </w:pPr>
+      <w:r>
+        <w:t xml:space="preserve">Many Orders</w:t>
+      </w:r>
+    </w:p>
+    <w:p>
+      <w:r>
+        <w:pict>
+          <v:rect style="width:0;height:1.5pt" o:hralign="center" o:hrstd="t" o:hr="t"/>
+        </w:pict>
+      </w:r>
+    </w:p>
+    <w:bookmarkEnd w:id="23"/>
+    <w:bookmarkStart w:id="24" w:name="exhibition"/>
+    <w:p>
+      <w:pPr>
+        <w:pStyle w:val="Heading3"/>
+      </w:pPr>
+      <w:r>
+        <w:t xml:space="preserve">4.12 Exhibition</w:t>
+      </w:r>
+    </w:p>
+    <w:p>
+      <w:pPr>
+        <w:pStyle w:val="FirstParagraph"/>
+      </w:pPr>
+      <w:r>
+        <w:t xml:space="preserve">Represents trade exhibitions.</w:t>
+      </w:r>
+    </w:p>
+    <w:p>
+      <w:pPr>
+        <w:pStyle w:val="BodyText"/>
+      </w:pPr>
+      <w:r>
+        <w:t xml:space="preserve">Purpose</w:t>
+      </w:r>
+    </w:p>
+    <w:p>
+      <w:pPr>
+        <w:pStyle w:val="BodyText"/>
+      </w:pPr>
+      <w:r>
+        <w:t xml:space="preserve">Discover Suppliers.</w:t>
+      </w:r>
+    </w:p>
+    <w:p>
+      <w:pPr>
+        <w:pStyle w:val="BodyText"/>
+      </w:pPr>
+      <w:r>
+        <w:t xml:space="preserve">Discover Products.</w:t>
+      </w:r>
+    </w:p>
+    <w:p>
+      <w:pPr>
+        <w:pStyle w:val="BodyText"/>
+      </w:pPr>
+      <w:r>
+        <w:t xml:space="preserve">Generate Leads.</w:t>
+      </w:r>
+    </w:p>
+    <w:p>
+      <w:r>
+        <w:pict>
+          <v:rect style="width:0;height:1.5pt" o:hralign="center" o:hrstd="t" o:hr="t"/>
+        </w:pict>
+      </w:r>
+    </w:p>
+    <w:bookmarkEnd w:id="24"/>
+    <w:bookmarkStart w:id="25" w:name="category"/>
+    <w:p>
+      <w:pPr>
+        <w:pStyle w:val="Heading3"/>
+      </w:pPr>
+      <w:r>
+        <w:t xml:space="preserve">4.13 Category</w:t>
+      </w:r>
+    </w:p>
+    <w:p>
+      <w:pPr>
+        <w:pStyle w:val="FirstParagraph"/>
+      </w:pPr>
+      <w:r>
+        <w:t xml:space="preserve">Represents product classification.</w:t>
+      </w:r>
+    </w:p>
+    <w:p>
+      <w:pPr>
+        <w:pStyle w:val="BodyText"/>
+      </w:pPr>
+      <w:r>
+        <w:t xml:space="preserve">Examples</w:t>
+      </w:r>
+    </w:p>
+    <w:p>
+      <w:pPr>
+        <w:pStyle w:val="BodyText"/>
+      </w:pPr>
+      <w:r>
+        <w:t xml:space="preserve">Kitchen</w:t>
+      </w:r>
+    </w:p>
+    <w:p>
+      <w:pPr>
+        <w:pStyle w:val="BodyText"/>
+      </w:pPr>
+      <w:r>
+        <w:t xml:space="preserve">Beauty</w:t>
+      </w:r>
+    </w:p>
+    <w:p>
+      <w:pPr>
+        <w:pStyle w:val="BodyText"/>
+      </w:pPr>
+      <w:r>
+        <w:t xml:space="preserve">Pet</w:t>
+      </w:r>
+    </w:p>
+    <w:p>
+      <w:pPr>
+        <w:pStyle w:val="BodyText"/>
+      </w:pPr>
+      <w:r>
+        <w:t xml:space="preserve">Camping</w:t>
+      </w:r>
+    </w:p>
+    <w:p>
+      <w:pPr>
+        <w:pStyle w:val="BodyText"/>
+      </w:pPr>
+      <w:r>
+        <w:t xml:space="preserve">Home</w:t>
+      </w:r>
+    </w:p>
+    <w:p>
+      <w:pPr>
+        <w:pStyle w:val="BodyText"/>
+      </w:pPr>
+      <w:r>
+        <w:t xml:space="preserve">Gift</w:t>
+      </w:r>
+    </w:p>
+    <w:p>
+      <w:pPr>
+        <w:pStyle w:val="BodyText"/>
+      </w:pPr>
+      <w:r>
+        <w:t xml:space="preserve">Industrial</w:t>
+      </w:r>
+    </w:p>
+    <w:p>
+      <w:r>
+        <w:pict>
+          <v:rect style="width:0;height:1.5pt" o:hralign="center" o:hrstd="t" o:hr="t"/>
+        </w:pict>
+      </w:r>
+    </w:p>
+    <w:bookmarkEnd w:id="25"/>
+    <w:bookmarkEnd w:id="26"/>
+    <w:bookmarkEnd w:id="27"/>
+    <w:bookmarkStart w:id="28" w:name="relationship-matrix"/>
+    <w:p>
+      <w:pPr>
+        <w:pStyle w:val="Heading1"/>
+      </w:pPr>
+      <w:r>
+        <w:t xml:space="preserve">5 Relationship Matrix</w:t>
+      </w:r>
+    </w:p>
+    <w:tbl>
+      <w:tblPr>
+        <w:tblStyle w:val="Table"/>
+        <w:tblW w:type="auto" w:w="0"/>
+        <w:tblLook w:firstRow="1" w:lastRow="0" w:firstColumn="0" w:lastColumn="0" w:noHBand="0" w:noVBand="0" w:val="0020"/>
+      </w:tblPr>
+      <w:tblGrid>
+        <w:gridCol w:w="3960"/>
+        <w:gridCol w:w="3960"/>
+      </w:tblGrid>
+      <w:tr>
+        <w:trPr>
+          <w:tblHeader w:val="on"/>
+        </w:trPr>
+        <w:tc>
+          <w:tcPr/>
+          <w:p>
+            <w:pPr>
+              <w:pStyle w:val="Compact"/>
+            </w:pPr>
+            <w:r>
+              <w:t xml:space="preserve">Domain</w:t>
+            </w:r>
+          </w:p>
+        </w:tc>
+        <w:tc>
+          <w:tcPr/>
+          <w:p>
+            <w:pPr>
+              <w:pStyle w:val="Compact"/>
+            </w:pPr>
+            <w:r>
+              <w:t xml:space="preserve">Relationship</w:t>
+            </w:r>
+          </w:p>
+        </w:tc>
+      </w:tr>
+      <w:tr>
+        <w:tc>
+          <w:tcPr/>
+          <w:p>
+            <w:pPr>
+              <w:pStyle w:val="Compact"/>
+            </w:pPr>
+            <w:r>
+              <w:t xml:space="preserve">Supplier</w:t>
+            </w:r>
+          </w:p>
+        </w:tc>
+        <w:tc>
+          <w:tcPr/>
+          <w:p>
+            <w:pPr>
+              <w:pStyle w:val="Compact"/>
+            </w:pPr>
+            <w:r>
+              <w:t xml:space="preserve">1:N Brand</w:t>
+            </w:r>
+          </w:p>
+        </w:tc>
+      </w:tr>
+      <w:tr>
+        <w:tc>
+          <w:tcPr/>
+          <w:p>
+            <w:pPr>
+              <w:pStyle w:val="Compact"/>
+            </w:pPr>
+            <w:r>
+              <w:t xml:space="preserve">Brand</w:t>
+            </w:r>
+          </w:p>
+        </w:tc>
+        <w:tc>
+          <w:tcPr/>
+          <w:p>
+            <w:pPr>
+              <w:pStyle w:val="Compact"/>
+            </w:pPr>
+            <w:r>
+              <w:t xml:space="preserve">1:N Product</w:t>
+            </w:r>
+          </w:p>
+        </w:tc>
+      </w:tr>
+      <w:tr>
+        <w:tc>
+          <w:tcPr/>
+          <w:p>
+            <w:pPr>
+              <w:pStyle w:val="Compact"/>
+            </w:pPr>
+            <w:r>
+              <w:t xml:space="preserve">Product</w:t>
+            </w:r>
+          </w:p>
+        </w:tc>
+        <w:tc>
+          <w:tcPr/>
+          <w:p>
+            <w:pPr>
+              <w:pStyle w:val="Compact"/>
+            </w:pPr>
+            <w:r>
+              <w:t xml:space="preserve">N:M Catalog</w:t>
+            </w:r>
+          </w:p>
+        </w:tc>
+      </w:tr>
+      <w:tr>
+        <w:tc>
+          <w:tcPr/>
+          <w:p>
+            <w:pPr>
+              <w:pStyle w:val="Compact"/>
+            </w:pPr>
+            <w:r>
+              <w:t xml:space="preserve">Catalog</w:t>
+            </w:r>
+          </w:p>
+        </w:tc>
+        <w:tc>
+          <w:tcPr/>
+          <w:p>
+            <w:pPr>
+              <w:pStyle w:val="Compact"/>
+            </w:pPr>
+            <w:r>
+              <w:t xml:space="preserve">1:N Catalog Item</w:t>
+            </w:r>
+          </w:p>
+        </w:tc>
+      </w:tr>
+      <w:tr>
+        <w:tc>
+          <w:tcPr/>
+          <w:p>
+            <w:pPr>
+              <w:pStyle w:val="Compact"/>
+            </w:pPr>
+            <w:r>
+              <w:t xml:space="preserve">Lead</w:t>
+            </w:r>
+          </w:p>
+        </w:tc>
+        <w:tc>
+          <w:tcPr/>
+          <w:p>
+            <w:pPr>
+              <w:pStyle w:val="Compact"/>
+            </w:pPr>
+            <w:r>
+              <w:t xml:space="preserve">1:N Inquiry</w:t>
+            </w:r>
+          </w:p>
+        </w:tc>
+      </w:tr>
+      <w:tr>
+        <w:tc>
+          <w:tcPr/>
+          <w:p>
+            <w:pPr>
+              <w:pStyle w:val="Compact"/>
+            </w:pPr>
+            <w:r>
+              <w:t xml:space="preserve">Inquiry</w:t>
+            </w:r>
+          </w:p>
+        </w:tc>
+        <w:tc>
+          <w:tcPr/>
+          <w:p>
+            <w:pPr>
+              <w:pStyle w:val="Compact"/>
+            </w:pPr>
+            <w:r>
+              <w:t xml:space="preserve">1:1 Quote</w:t>
+            </w:r>
+          </w:p>
+        </w:tc>
+      </w:tr>
+      <w:tr>
+        <w:tc>
+          <w:tcPr/>
+          <w:p>
+            <w:pPr>
+              <w:pStyle w:val="Compact"/>
+            </w:pPr>
+            <w:r>
+              <w:t xml:space="preserve">Quote</w:t>
+            </w:r>
+          </w:p>
+        </w:tc>
+        <w:tc>
+          <w:tcPr/>
+          <w:p>
+            <w:pPr>
+              <w:pStyle w:val="Compact"/>
+            </w:pPr>
+            <w:r>
+              <w:t xml:space="preserve">1:1 Purchase Order</w:t>
+            </w:r>
+          </w:p>
+        </w:tc>
+      </w:tr>
+      <w:tr>
+        <w:tc>
+          <w:tcPr/>
+          <w:p>
+            <w:pPr>
+              <w:pStyle w:val="Compact"/>
+            </w:pPr>
+            <w:r>
+              <w:t xml:space="preserve">Purchase Order</w:t>
+            </w:r>
+          </w:p>
+        </w:tc>
+        <w:tc>
+          <w:tcPr/>
+          <w:p>
+            <w:pPr>
+              <w:pStyle w:val="Compact"/>
+            </w:pPr>
+            <w:r>
+              <w:t xml:space="preserve">1:N Shipment</w:t>
+            </w:r>
+          </w:p>
+        </w:tc>
+      </w:tr>
+      <w:tr>
+        <w:tc>
+          <w:tcPr/>
+          <w:p>
+            <w:pPr>
+              <w:pStyle w:val="Compact"/>
+            </w:pPr>
+            <w:r>
+              <w:t xml:space="preserve">Customer</w:t>
+            </w:r>
+          </w:p>
+        </w:tc>
+        <w:tc>
+          <w:tcPr/>
+          <w:p>
+            <w:pPr>
+              <w:pStyle w:val="Compact"/>
+            </w:pPr>
+            <w:r>
+              <w:t xml:space="preserve">1:N Inquiry</w:t>
+            </w:r>
+          </w:p>
+        </w:tc>
+      </w:tr>
+    </w:tbl>
+    <w:p>
+      <w:r>
+        <w:pict>
+          <v:rect style="width:0;height:1.5pt" o:hralign="center" o:hrstd="t" o:hr="t"/>
+        </w:pict>
+      </w:r>
+    </w:p>
+    <w:bookmarkEnd w:id="28"/>
+    <w:bookmarkStart w:id="29" w:name="aggregate-design-ddd"/>
+    <w:p>
+      <w:pPr>
+        <w:pStyle w:val="Heading1"/>
+      </w:pPr>
+      <w:r>
+        <w:t xml:space="preserve">6 Aggregate Design (DDD)</w:t>
+      </w:r>
+    </w:p>
+    <w:p>
+      <w:pPr>
+        <w:pStyle w:val="FirstParagraph"/>
+      </w:pPr>
+      <w:r>
+        <w:t xml:space="preserve">Supplier Aggregate</w:t>
+      </w:r>
+    </w:p>
+    <w:p>
+      <w:pPr>
+        <w:pStyle w:val="BodyText"/>
+      </w:pPr>
+      <w:r>
+        <w:t xml:space="preserve">Supplier</w:t>
+      </w:r>
+    </w:p>
+    <w:p>
+      <w:pPr>
+        <w:pStyle w:val="BodyText"/>
+      </w:pPr>
+      <w:r>
+        <w:t xml:space="preserve">Brand</w:t>
+      </w:r>
+    </w:p>
+    <w:p>
+      <w:pPr>
+        <w:pStyle w:val="BodyText"/>
+      </w:pPr>
+      <w:r>
+        <w:t xml:space="preserve">Product</w:t>
+      </w:r>
+    </w:p>
+    <w:p>
+      <w:pPr>
+        <w:pStyle w:val="BodyText"/>
+      </w:pPr>
+      <w:r>
+        <w:t xml:space="preserve">Catalog Aggregate</w:t>
+      </w:r>
+    </w:p>
+    <w:p>
+      <w:pPr>
+        <w:pStyle w:val="BodyText"/>
+      </w:pPr>
+      <w:r>
+        <w:t xml:space="preserve">Catalog</w:t>
+      </w:r>
+    </w:p>
+    <w:p>
+      <w:pPr>
+        <w:pStyle w:val="BodyText"/>
+      </w:pPr>
+      <w:r>
+        <w:t xml:space="preserve">Catalog Item</w:t>
+      </w:r>
+    </w:p>
+    <w:p>
+      <w:pPr>
+        <w:pStyle w:val="BodyText"/>
+      </w:pPr>
+      <w:r>
+        <w:t xml:space="preserve">Lead Aggregate</w:t>
+      </w:r>
+    </w:p>
+    <w:p>
+      <w:pPr>
+        <w:pStyle w:val="BodyText"/>
+      </w:pPr>
+      <w:r>
+        <w:t xml:space="preserve">Lead</w:t>
+      </w:r>
+    </w:p>
+    <w:p>
+      <w:pPr>
+        <w:pStyle w:val="BodyText"/>
+      </w:pPr>
+      <w:r>
+        <w:t xml:space="preserve">Inquiry</w:t>
+      </w:r>
+    </w:p>
+    <w:p>
+      <w:pPr>
+        <w:pStyle w:val="BodyText"/>
+      </w:pPr>
+      <w:r>
+        <w:t xml:space="preserve">Quotation</w:t>
+      </w:r>
+    </w:p>
+    <w:p>
+      <w:pPr>
+        <w:pStyle w:val="BodyText"/>
+      </w:pPr>
+      <w:r>
+        <w:t xml:space="preserve">Trade Aggregate</w:t>
+      </w:r>
+    </w:p>
+    <w:p>
+      <w:pPr>
+        <w:pStyle w:val="BodyText"/>
+      </w:pPr>
+      <w:r>
+        <w:t xml:space="preserve">Purchase Order</w:t>
+      </w:r>
+    </w:p>
+    <w:p>
+      <w:pPr>
+        <w:pStyle w:val="BodyText"/>
+      </w:pPr>
+      <w:r>
+        <w:t xml:space="preserve">Shipment</w:t>
+      </w:r>
+    </w:p>
+    <w:p>
+      <w:pPr>
+        <w:pStyle w:val="BodyText"/>
+      </w:pPr>
+      <w:r>
+        <w:t xml:space="preserve">Customer Aggregate</w:t>
+      </w:r>
+    </w:p>
+    <w:p>
+      <w:pPr>
+        <w:pStyle w:val="BodyText"/>
+      </w:pPr>
+      <w:r>
+        <w:t xml:space="preserve">Customer</w:t>
+      </w:r>
+    </w:p>
+    <w:p>
+      <w:pPr>
+        <w:pStyle w:val="BodyText"/>
+      </w:pPr>
+      <w:r>
+        <w:t xml:space="preserve">Contact</w:t>
+      </w:r>
+    </w:p>
+    <w:p>
+      <w:pPr>
+        <w:pStyle w:val="BodyText"/>
+      </w:pPr>
+      <w:r>
+        <w:t xml:space="preserve">Communication History</w:t>
+      </w:r>
+    </w:p>
+    <w:p>
+      <w:r>
+        <w:pict>
+          <v:rect style="width:0;height:1.5pt" o:hralign="center" o:hrstd="t" o:hr="t"/>
+        </w:pict>
+      </w:r>
+    </w:p>
+    <w:bookmarkEnd w:id="29"/>
+    <w:bookmarkStart w:id="30" w:name="domain-lifecycle"/>
+    <w:p>
+      <w:pPr>
+        <w:pStyle w:val="Heading1"/>
+      </w:pPr>
+      <w:r>
+        <w:t xml:space="preserve">7 Domain Lifecycle</w:t>
+      </w:r>
+    </w:p>
+    <w:p>
+      <w:pPr>
+        <w:pStyle w:val="FirstParagraph"/>
+      </w:pPr>
+      <w:r>
+        <w:t xml:space="preserve">Supplier</w:t>
+      </w:r>
+    </w:p>
+    <w:p>
+      <w:pPr>
+        <w:pStyle w:val="BodyText"/>
+      </w:pPr>
+      <w:r>
+        <w:t xml:space="preserve">↓</w:t>
+      </w:r>
+    </w:p>
+    <w:p>
+      <w:pPr>
+        <w:pStyle w:val="BodyText"/>
+      </w:pPr>
+      <w:r>
+        <w:t xml:space="preserve">Brand</w:t>
+      </w:r>
+    </w:p>
+    <w:p>
+      <w:pPr>
+        <w:pStyle w:val="BodyText"/>
+      </w:pPr>
+      <w:r>
+        <w:t xml:space="preserve">↓</w:t>
+      </w:r>
+    </w:p>
+    <w:p>
+      <w:pPr>
+        <w:pStyle w:val="BodyText"/>
+      </w:pPr>
+      <w:r>
+        <w:t xml:space="preserve">Product</w:t>
+      </w:r>
+    </w:p>
+    <w:p>
+      <w:pPr>
+        <w:pStyle w:val="BodyText"/>
+      </w:pPr>
+      <w:r>
+        <w:t xml:space="preserve">↓</w:t>
+      </w:r>
+    </w:p>
+    <w:p>
+      <w:pPr>
+        <w:pStyle w:val="BodyText"/>
+      </w:pPr>
+      <w:r>
+        <w:t xml:space="preserve">Catalog</w:t>
+      </w:r>
+    </w:p>
+    <w:p>
+      <w:pPr>
+        <w:pStyle w:val="BodyText"/>
+      </w:pPr>
+      <w:r>
+        <w:t xml:space="preserve">↓</w:t>
+      </w:r>
+    </w:p>
+    <w:p>
+      <w:pPr>
+        <w:pStyle w:val="BodyText"/>
+      </w:pPr>
+      <w:r>
+        <w:t xml:space="preserve">Lead</w:t>
+      </w:r>
+    </w:p>
+    <w:p>
+      <w:pPr>
+        <w:pStyle w:val="BodyText"/>
+      </w:pPr>
+      <w:r>
+        <w:t xml:space="preserve">↓</w:t>
+      </w:r>
+    </w:p>
+    <w:p>
+      <w:pPr>
+        <w:pStyle w:val="BodyText"/>
+      </w:pPr>
+      <w:r>
+        <w:t xml:space="preserve">Inquiry</w:t>
+      </w:r>
+    </w:p>
+    <w:p>
+      <w:pPr>
+        <w:pStyle w:val="BodyText"/>
+      </w:pPr>
+      <w:r>
+        <w:t xml:space="preserve">↓</w:t>
+      </w:r>
+    </w:p>
+    <w:p>
+      <w:pPr>
+        <w:pStyle w:val="BodyText"/>
+      </w:pPr>
+      <w:r>
+        <w:t xml:space="preserve">Quotation</w:t>
+      </w:r>
+    </w:p>
+    <w:p>
+      <w:pPr>
+        <w:pStyle w:val="BodyText"/>
+      </w:pPr>
+      <w:r>
+        <w:t xml:space="preserve">↓</w:t>
+      </w:r>
+    </w:p>
+    <w:p>
+      <w:pPr>
+        <w:pStyle w:val="BodyText"/>
+      </w:pPr>
+      <w:r>
+        <w:t xml:space="preserve">Purchase Order</w:t>
+      </w:r>
+    </w:p>
+    <w:p>
+      <w:pPr>
+        <w:pStyle w:val="BodyText"/>
+      </w:pPr>
+      <w:r>
+        <w:t xml:space="preserve">↓</w:t>
+      </w:r>
+    </w:p>
+    <w:p>
+      <w:pPr>
+        <w:pStyle w:val="BodyText"/>
+      </w:pPr>
+      <w:r>
+        <w:t xml:space="preserve">Shipment</w:t>
+      </w:r>
+    </w:p>
+    <w:p>
+      <w:pPr>
+        <w:pStyle w:val="BodyText"/>
+      </w:pPr>
+      <w:r>
+        <w:t xml:space="preserve">↓</w:t>
+      </w:r>
+    </w:p>
+    <w:p>
+      <w:pPr>
+        <w:pStyle w:val="BodyText"/>
+      </w:pPr>
+      <w:r>
+        <w:t xml:space="preserve">Customer</w:t>
+      </w:r>
+    </w:p>
+    <w:p>
+      <w:r>
+        <w:pict>
+          <v:rect style="width:0;height:1.5pt" o:hralign="center" o:hrstd="t" o:hr="t"/>
+        </w:pict>
+      </w:r>
+    </w:p>
+    <w:bookmarkEnd w:id="30"/>
+    <w:bookmarkStart w:id="31" w:name="design-principles"/>
+    <w:p>
+      <w:pPr>
+        <w:pStyle w:val="Heading1"/>
+      </w:pPr>
+      <w:r>
+        <w:t xml:space="preserve">8 Design Principles</w:t>
+      </w:r>
+    </w:p>
+    <w:p>
+      <w:pPr>
+        <w:pStyle w:val="FirstParagraph"/>
+      </w:pPr>
+      <w:r>
+        <w:t xml:space="preserve">Business First</w:t>
+      </w:r>
+    </w:p>
+    <w:p>
+      <w:pPr>
+        <w:pStyle w:val="BodyText"/>
+      </w:pPr>
+      <w:r>
+        <w:t xml:space="preserve">Domain Driven Design</w:t>
+      </w:r>
+    </w:p>
+    <w:p>
+      <w:pPr>
+        <w:pStyle w:val="BodyText"/>
+      </w:pPr>
+      <w:r>
+        <w:t xml:space="preserve">Loose Coupling</w:t>
+      </w:r>
+    </w:p>
+    <w:p>
+      <w:pPr>
+        <w:pStyle w:val="BodyText"/>
+      </w:pPr>
+      <w:r>
+        <w:t xml:space="preserve">High Cohesion</w:t>
+      </w:r>
+    </w:p>
+    <w:p>
+      <w:pPr>
+        <w:pStyle w:val="BodyText"/>
+      </w:pPr>
+      <w:r>
+        <w:t xml:space="preserve">Scalable Architecture</w:t>
+      </w:r>
+    </w:p>
+    <w:p>
+      <w:r>
+        <w:pict>
+          <v:rect style="width:0;height:1.5pt" o:hralign="center" o:hrstd="t" o:hr="t"/>
+        </w:pict>
+      </w:r>
+    </w:p>
+    <w:bookmarkEnd w:id="31"/>
+    <w:bookmarkStart w:id="32" w:name="future-expansion"/>
+    <w:p>
+      <w:pPr>
+        <w:pStyle w:val="Heading1"/>
+      </w:pPr>
+      <w:r>
+        <w:t xml:space="preserve">9 Future Expansion</w:t>
+      </w:r>
+    </w:p>
+    <w:p>
+      <w:pPr>
+        <w:pStyle w:val="FirstParagraph"/>
+      </w:pPr>
+      <w:r>
+        <w:t xml:space="preserve">CRM</w:t>
+      </w:r>
+    </w:p>
+    <w:p>
+      <w:pPr>
+        <w:pStyle w:val="BodyText"/>
+      </w:pPr>
+      <w:r>
+        <w:t xml:space="preserve">Supplier Portal</w:t>
+      </w:r>
+    </w:p>
+    <w:p>
+      <w:pPr>
+        <w:pStyle w:val="BodyText"/>
+      </w:pPr>
+      <w:r>
+        <w:t xml:space="preserve">Customer Portal</w:t>
+      </w:r>
+    </w:p>
+    <w:p>
+      <w:pPr>
+        <w:pStyle w:val="BodyText"/>
+      </w:pPr>
+      <w:r>
+        <w:t xml:space="preserve">Marketing Automation</w:t>
+      </w:r>
+    </w:p>
+    <w:p>
+      <w:pPr>
+        <w:pStyle w:val="BodyText"/>
+      </w:pPr>
+      <w:r>
+        <w:t xml:space="preserve">AI Recommendation</w:t>
+      </w:r>
+    </w:p>
+    <w:p>
+      <w:pPr>
+        <w:pStyle w:val="BodyText"/>
+      </w:pPr>
+      <w:r>
+        <w:t xml:space="preserve">Business Intelligence</w:t>
+      </w:r>
+    </w:p>
+    <w:bookmarkEnd w:id="32"/>
     <w:sectPr>
       <w:footnotePr>
         <w:numRestart w:val="eachSect"/>
@@ -359,8 +2379,120 @@
       </w:pPr>
     </w:lvl>
   </w:abstractNum>
+  <w:abstractNum w:abstractNumId="991">
+    <w:nsid w:val="0000A991"/>
+    <w:multiLevelType w:val="multilevel"/>
+    <w:lvl w:ilvl="0">
+      <w:numFmt w:val="bullet"/>
+      <w:lvlText w:val=""/>
+      <w:lvlJc w:val="left"/>
+      <w:pPr>
+        <w:ind w:left="720" w:hanging="360"/>
+      </w:pPr>
+      <w:rPr>
+        <w:rFonts w:ascii="Symbol" w:hAnsi="Symbol" w:cs="Symbol" w:hint="default"/>
+      </w:rPr>
+    </w:lvl>
+    <w:lvl w:ilvl="1">
+      <w:numFmt w:val="bullet"/>
+      <w:lvlText w:val="o"/>
+      <w:lvlJc w:val="left"/>
+      <w:pPr>
+        <w:ind w:left="1440" w:hanging="360"/>
+      </w:pPr>
+      <w:rPr>
+        <w:rFonts w:ascii="Courier New" w:hAnsi="Courier New" w:cs="Courier New" w:hint="default"/>
+      </w:rPr>
+    </w:lvl>
+    <w:lvl w:ilvl="2">
+      <w:numFmt w:val="bullet"/>
+      <w:lvlText w:val=""/>
+      <w:lvlJc w:val="left"/>
+      <w:pPr>
+        <w:ind w:left="2160" w:hanging="360"/>
+      </w:pPr>
+      <w:rPr>
+        <w:rFonts w:ascii="Wingdings" w:hAnsi="Wingdings" w:cs="Wingdings" w:hint="default"/>
+      </w:rPr>
+    </w:lvl>
+    <w:lvl w:ilvl="3">
+      <w:numFmt w:val="bullet"/>
+      <w:lvlText w:val=""/>
+      <w:lvlJc w:val="left"/>
+      <w:pPr>
+        <w:ind w:left="2880" w:hanging="360"/>
+      </w:pPr>
+      <w:rPr>
+        <w:rFonts w:ascii="Symbol" w:hAnsi="Symbol" w:cs="Symbol" w:hint="default"/>
+      </w:rPr>
+    </w:lvl>
+    <w:lvl w:ilvl="4">
+      <w:numFmt w:val="bullet"/>
+      <w:lvlText w:val="o"/>
+      <w:lvlJc w:val="left"/>
+      <w:pPr>
+        <w:ind w:left="3600" w:hanging="360"/>
+      </w:pPr>
+      <w:rPr>
+        <w:rFonts w:ascii="Courier New" w:hAnsi="Courier New" w:cs="Courier New" w:hint="default"/>
+      </w:rPr>
+    </w:lvl>
+    <w:lvl w:ilvl="5">
+      <w:numFmt w:val="bullet"/>
+      <w:lvlText w:val=""/>
+      <w:lvlJc w:val="left"/>
+      <w:pPr>
+        <w:ind w:left="4320" w:hanging="360"/>
+      </w:pPr>
+      <w:rPr>
+        <w:rFonts w:ascii="Wingdings" w:hAnsi="Wingdings" w:cs="Wingdings" w:hint="default"/>
+      </w:rPr>
+    </w:lvl>
+    <w:lvl w:ilvl="6">
+      <w:numFmt w:val="bullet"/>
+      <w:lvlText w:val=""/>
+      <w:lvlJc w:val="left"/>
+      <w:pPr>
+        <w:ind w:left="5040" w:hanging="360"/>
+      </w:pPr>
+      <w:rPr>
+        <w:rFonts w:ascii="Symbol" w:hAnsi="Symbol" w:cs="Symbol" w:hint="default"/>
+      </w:rPr>
+    </w:lvl>
+    <w:lvl w:ilvl="7">
+      <w:numFmt w:val="bullet"/>
+      <w:lvlText w:val="o"/>
+      <w:lvlJc w:val="left"/>
+      <w:pPr>
+        <w:ind w:left="5760" w:hanging="360"/>
+      </w:pPr>
+      <w:rPr>
+        <w:rFonts w:ascii="Courier New" w:hAnsi="Courier New" w:cs="Courier New" w:hint="default"/>
+      </w:rPr>
+    </w:lvl>
+    <w:lvl w:ilvl="8">
+      <w:numFmt w:val="bullet"/>
+      <w:lvlText w:val=""/>
+      <w:lvlJc w:val="left"/>
+      <w:pPr>
+        <w:ind w:left="6480" w:hanging="360"/>
+      </w:pPr>
+      <w:rPr>
+        <w:rFonts w:ascii="Wingdings" w:hAnsi="Wingdings" w:cs="Wingdings" w:hint="default"/>
+      </w:rPr>
+    </w:lvl>
+  </w:abstractNum>
   <w:num w:numId="1000">
     <w:abstractNumId w:val="990"/>
+  </w:num>
+  <w:num w:numId="1001">
+    <w:abstractNumId w:val="991"/>
+  </w:num>
+  <w:num w:numId="1002">
+    <w:abstractNumId w:val="991"/>
+  </w:num>
+  <w:num w:numId="1003">
+    <w:abstractNumId w:val="991"/>
   </w:num>
 </w:numbering>
 </file>

</xml_diff>